<commit_message>
orcamentos calculo automatico do desconto e acressimo e fornecedores bug de pagar cnpj
</commit_message>
<xml_diff>
--- a/uploads/Proposta/Proposta-Adicional__EXPO POSTOS_.docx
+++ b/uploads/Proposta/Proposta-Adicional__EXPO POSTOS_.docx
@@ -654,7 +654,7 @@
           <w:sz w:val="24"/>
           <w:szCs w:val="24"/>
         </w:rPr>
-        <w:t xml:space="preserve">• 1 Fiscal Noturno, (EXTRA), 1 Diária(s), de: 10/09/2026 até: 10/09/2026</w:t>
+        <w:t xml:space="preserve">• 1 Fiscal Noturno, (SOL. CLAUDIA), 1 Diária(s), de: 03/09/2026 até: 03/09/2026</w:t>
       </w:r>
     </w:p>
     <w:p>
@@ -695,7 +695,11 @@
           <w:sz w:val="24"/>
           <w:szCs w:val="24"/>
         </w:rPr>
-        <w:t xml:space="preserve">• 1 Fiscal Noturno, (EXTRAS), 4 Diária(s), de: 04/09/2026 até: 07/09/2026</w:t>
+        <w:t xml:space="preserve">• 2 Fiscal Diurno</w:t>
+        <w:br/>
+        <w:t xml:space="preserve">        </w:t>
+        <w:br/>
+        <w:t xml:space="preserve">        [Adicional], (EXTRAS 2), 4 Diária(s), de: 04/09/2026 até: 07/09/2026</w:t>
       </w:r>
     </w:p>
     <w:p>
@@ -736,7 +740,56 @@
           <w:sz w:val="24"/>
           <w:szCs w:val="24"/>
         </w:rPr>
-        <w:t xml:space="preserve">• 2 Fiscal Diurno, (EXTRAS 2), 4 Diária(s), de: 04/09/2026 até: 07/09/2026</w:t>
+        <w:t xml:space="preserve">• 1 Fiscal Noturno</w:t>
+        <w:br/>
+        <w:t xml:space="preserve">        </w:t>
+        <w:br/>
+        <w:t xml:space="preserve">        [Adicional], (EXTRA), 1 Diária(s), de: 10/09/2026 até: 10/09/2026</w:t>
+      </w:r>
+    </w:p>
+    <w:p>
+      <w:pPr>
+        <w:pStyle w:val="PargrafodaLista"/>
+        <w:spacing w:line="285" w:lineRule="atLeast"/>
+        <w:ind w:left="0"/>
+        <w:rPr>
+          <w:rFonts w:ascii="Abel" w:hAnsi="Abel"/>
+          <w:sz w:val="24"/>
+          <w:szCs w:val="24"/>
+        </w:rPr>
+      </w:pPr>
+      <w:r>
+        <w:rPr>
+          <w:rFonts w:ascii="Abel" w:hAnsi="Abel"/>
+          <w:sz w:val="24"/>
+          <w:szCs w:val="24"/>
+        </w:rPr>
+        <w:t xml:space="preserve"/>
+      </w:r>
+    </w:p>
+    <w:p>
+      <w:pPr>
+        <w:pStyle w:val="PargrafodaLista"/>
+        <w:spacing w:line="285" w:lineRule="atLeast"/>
+        <w:ind w:left="0"/>
+        <w:rPr>
+          <w:rFonts w:ascii="Abel" w:hAnsi="Abel"/>
+          <w:sz w:val="24"/>
+          <w:szCs w:val="24"/>
+        </w:rPr>
+      </w:pPr>
+      <w:proofErr w:type="gramStart"/>
+      <w:r>
+        <w:rPr>
+          <w:rFonts w:ascii="Abel" w:hAnsi="Abel"/>
+          <w:sz w:val="24"/>
+          <w:szCs w:val="24"/>
+        </w:rPr>
+        <w:t xml:space="preserve">• 1 Fiscal Noturno</w:t>
+        <w:br/>
+        <w:t xml:space="preserve">        </w:t>
+        <w:br/>
+        <w:t xml:space="preserve">        [Adicional], (EXTRAS), 4 Diária(s), de: 04/09/2026 até: 07/09/2026</w:t>
       </w:r>
     </w:p>
     <w:p>
@@ -925,7 +978,7 @@
           <w:sz w:val="24"/>
           <w:szCs w:val="24"/>
         </w:rPr>
-        <w:t xml:space="preserve">R$ 8.723,00</w:t>
+        <w:t xml:space="preserve">R$ 9.394,00</w:t>
       </w:r>
       <w:r>
         <w:rPr>
@@ -1105,7 +1158,7 @@
           <w:i/>
           <w:iCs/>
         </w:rPr>
-        <w:t xml:space="preserve">13/08/2026</w:t>
+        <w:t xml:space="preserve">16/09/2026</w:t>
       </w:r>
     </w:p>
     <w:p>

</xml_diff>